<commit_message>
Final submission CA3 AI for games
</commit_message>
<xml_diff>
--- a/Docs/AI for games/CA3 - Reflective Document.docx
+++ b/Docs/AI for games/CA3 - Reflective Document.docx
@@ -105,7 +105,57 @@
     </w:p>
     <w:p>
       <w:r>
-        <w:t xml:space="preserve">Video: </w:t>
+        <w:t>Presentation</w:t>
+      </w:r>
+      <w:r>
+        <w:t>:</w:t>
+      </w:r>
+      <w:r>
+        <w:t xml:space="preserve"> </w:t>
+      </w:r>
+      <w:hyperlink r:id="rId6" w:history="1">
+        <w:r>
+          <w:rPr>
+            <w:rStyle w:val="Hyperlink"/>
+          </w:rPr>
+          <w:t>https://youtu.be/BXB1m</w:t>
+        </w:r>
+        <w:r>
+          <w:rPr>
+            <w:rStyle w:val="Hyperlink"/>
+          </w:rPr>
+          <w:t>q</w:t>
+        </w:r>
+        <w:r>
+          <w:rPr>
+            <w:rStyle w:val="Hyperlink"/>
+          </w:rPr>
+          <w:t>lefsQ</w:t>
+        </w:r>
+      </w:hyperlink>
+      <w:r>
+        <w:t xml:space="preserve"> </w:t>
+      </w:r>
+    </w:p>
+    <w:p>
+      <w:r>
+        <w:t xml:space="preserve">Unity Video: </w:t>
+      </w:r>
+      <w:hyperlink r:id="rId7" w:history="1">
+        <w:r>
+          <w:rPr>
+            <w:rStyle w:val="Hyperlink"/>
+          </w:rPr>
+          <w:t>https://youtu.be/XPr8yMRIV1A</w:t>
+        </w:r>
+      </w:hyperlink>
+      <w:r>
+        <w:t xml:space="preserve"> </w:t>
+      </w:r>
+    </w:p>
+    <w:p>
+      <w:r>
+        <w:t xml:space="preserve"> </w:t>
       </w:r>
     </w:p>
     <w:p>
@@ -118,9 +168,7 @@
           <w:u w:val="single"/>
         </w:rPr>
       </w:pPr>
-    </w:p>
-    <w:p>
-      <w:pPr>
+      <w:r>
         <w:rPr>
           <w:b/>
           <w:bCs/>
@@ -128,15 +176,6 @@
           <w:szCs w:val="24"/>
           <w:u w:val="single"/>
         </w:rPr>
-      </w:pPr>
-      <w:r>
-        <w:rPr>
-          <w:b/>
-          <w:bCs/>
-          <w:sz w:val="24"/>
-          <w:szCs w:val="24"/>
-          <w:u w:val="single"/>
-        </w:rPr>
         <w:t>Integrated Technical Account</w:t>
       </w:r>
     </w:p>
@@ -195,9 +234,9 @@
     <w:p>
       <w:r>
         <w:drawing>
-          <wp:inline distT="0" distB="0" distL="0" distR="0" wp14:anchorId="4006173E" wp14:editId="40CEA376">
-            <wp:extent cx="5089585" cy="3740783"/>
-            <wp:effectExtent l="0" t="0" r="0" b="0"/>
+          <wp:inline distT="0" distB="0" distL="0" distR="0" wp14:anchorId="4006173E" wp14:editId="1B9ABC36">
+            <wp:extent cx="4659514" cy="3424687"/>
+            <wp:effectExtent l="0" t="0" r="8255" b="4445"/>
             <wp:docPr id="194780099" name="Picture 1"/>
             <wp:cNvGraphicFramePr>
               <a:graphicFrameLocks xmlns:a="http://schemas.openxmlformats.org/drawingml/2006/main" noChangeAspect="1"/>
@@ -210,7 +249,7 @@
                     <pic:cNvPicPr/>
                   </pic:nvPicPr>
                   <pic:blipFill>
-                    <a:blip r:embed="rId6"/>
+                    <a:blip r:embed="rId8"/>
                     <a:stretch>
                       <a:fillRect/>
                     </a:stretch>
@@ -218,7 +257,7 @@
                   <pic:spPr>
                     <a:xfrm>
                       <a:off x="0" y="0"/>
-                      <a:ext cx="5099128" cy="3747797"/>
+                      <a:ext cx="4677128" cy="3437633"/>
                     </a:xfrm>
                     <a:prstGeom prst="rect">
                       <a:avLst/>
@@ -320,7 +359,7 @@
                     <pic:cNvPicPr/>
                   </pic:nvPicPr>
                   <pic:blipFill>
-                    <a:blip r:embed="rId7"/>
+                    <a:blip r:embed="rId9"/>
                     <a:stretch>
                       <a:fillRect/>
                     </a:stretch>
@@ -429,7 +468,7 @@
                     <pic:cNvPicPr/>
                   </pic:nvPicPr>
                   <pic:blipFill>
-                    <a:blip r:embed="rId8"/>
+                    <a:blip r:embed="rId10"/>
                     <a:stretch>
                       <a:fillRect/>
                     </a:stretch>
@@ -577,7 +616,7 @@
                     <pic:cNvPicPr/>
                   </pic:nvPicPr>
                   <pic:blipFill>
-                    <a:blip r:embed="rId9"/>
+                    <a:blip r:embed="rId11"/>
                     <a:stretch>
                       <a:fillRect/>
                     </a:stretch>
@@ -746,7 +785,7 @@
                     <pic:cNvPicPr/>
                   </pic:nvPicPr>
                   <pic:blipFill>
-                    <a:blip r:embed="rId10"/>
+                    <a:blip r:embed="rId12"/>
                     <a:stretch>
                       <a:fillRect/>
                     </a:stretch>
@@ -956,7 +995,7 @@
                     <pic:cNvPicPr/>
                   </pic:nvPicPr>
                   <pic:blipFill>
-                    <a:blip r:embed="rId11"/>
+                    <a:blip r:embed="rId13"/>
                     <a:stretch>
                       <a:fillRect/>
                     </a:stretch>
@@ -1174,7 +1213,7 @@
       <w:r>
         <w:br/>
       </w:r>
-      <w:hyperlink r:id="rId12" w:tgtFrame="_new" w:history="1">
+      <w:hyperlink r:id="rId14" w:tgtFrame="_new" w:history="1">
         <w:r>
           <w:rPr>
             <w:rStyle w:val="Hyperlink"/>
@@ -1206,7 +1245,7 @@
       <w:r>
         <w:br/>
       </w:r>
-      <w:hyperlink r:id="rId13" w:history="1">
+      <w:hyperlink r:id="rId15" w:history="1">
         <w:r>
           <w:rPr>
             <w:rStyle w:val="Hyperlink"/>
@@ -1232,7 +1271,7 @@
       <w:r>
         <w:br/>
       </w:r>
-      <w:hyperlink r:id="rId14" w:tgtFrame="_new" w:history="1">
+      <w:hyperlink r:id="rId16" w:tgtFrame="_new" w:history="1">
         <w:r>
           <w:rPr>
             <w:rStyle w:val="Hyperlink"/>
@@ -1260,7 +1299,7 @@
       <w:r>
         <w:br/>
       </w:r>
-      <w:hyperlink r:id="rId15" w:history="1">
+      <w:hyperlink r:id="rId17" w:history="1">
         <w:r>
           <w:rPr>
             <w:rStyle w:val="Hyperlink"/>

</xml_diff>